<commit_message>
Add parking field to brief template and substitution map
The DOCX brief template was missing the {{PARKING}} placeholder entirely,
and createBriefDoc()'s map object had no entry for it. Added a "חניה"
section to brief-template.docx (between Transportation and Schedule) and
added '{{PARKING}}' → payload.parking to the map so parking appears in
the coordination sheet when the PDF toggle is on.

Co-Authored-By: Claude Sonnet 4.6 <noreply@anthropic.com>
</commit_message>
<xml_diff>
--- a/server/data/brief-template.docx
+++ b/server/data/brief-template.docx
@@ -343,6 +343,48 @@
           <w:szCs w:val="22"/>
         </w:rPr>
         <w:t>{{TRANSPORTATION}}</w:t>
+      </w:r>
+    </w:p>
+    <w:p>
+      <w:pPr>
+        <w:bidi/>
+        <w:spacing w:after="0"/>
+      </w:pPr>
+    </w:p>
+    <w:p>
+      <w:pPr>
+        <w:pBdr>
+          <w:bottom w:val="single" w:sz="16" w:space="4" w:color="2D4399"/>
+        </w:pBdr>
+        <w:bidi/>
+        <w:spacing w:before="360"/>
+      </w:pPr>
+      <w:r>
+        <w:rPr>
+          <w:rFonts w:ascii="Assistant" w:hAnsi="Assistant" w:cs="Assistant"/>
+          <w:b/>
+          <w:bCs/>
+          <w:color w:val="1F1B17"/>
+          <w:sz w:val="26"/>
+          <w:szCs w:val="26"/>
+          <w:rtl/>
+        </w:rPr>
+        <w:t>חנייה</w:t>
+      </w:r>
+    </w:p>
+    <w:p>
+      <w:pPr>
+        <w:bidi/>
+        <w:spacing w:after="0"/>
+      </w:pPr>
+      <w:r>
+        <w:rPr>
+          <w:rFonts w:ascii="Assistant" w:hAnsi="Assistant" w:cs="Assistant"/>
+          <w:color w:val="1F1B17"/>
+          <w:sz w:val="22"/>
+          <w:szCs w:val="22"/>
+        </w:rPr>
+        <w:t>{{PARKING}}</w:t>
       </w:r>
     </w:p>
     <w:p>

</xml_diff>